<commit_message>
docs: add AI-assisted title and illustrated business presentation
</commit_message>
<xml_diff>
--- a/申请书/申请书摘要与正文_2027修订稿.docx
+++ b/申请书/申请书摘要与正文_2027修订稿.docx
@@ -2,13 +2,13 @@
 <file path=word/document.xml><?xml version="1.0" encoding="utf-8"?>
 <w:document xmlns:w="http://schemas.openxmlformats.org/wordprocessingml/2006/main" xmlns:m="http://schemas.openxmlformats.org/officeDocument/2006/math" xmlns:r="http://schemas.openxmlformats.org/officeDocument/2006/relationships" xmlns:o="urn:schemas-microsoft-com:office:office" xmlns:v="urn:schemas-microsoft-com:vml" xmlns:w10="urn:schemas-microsoft-com:office:word" xmlns:a="http://schemas.openxmlformats.org/drawingml/2006/main" xmlns:pic="http://schemas.openxmlformats.org/drawingml/2006/picture" xmlns:wp="http://schemas.openxmlformats.org/drawingml/2006/wordprocessingDrawing">
   <w:body>
-    <w:bookmarkStart w:id="57" w:name="cage双位点取代smmg₂bi₂的局域畸变与载流子散射机制"/>
+    <w:bookmarkStart w:id="57" w:name="ai辅助的cage双位点取代smmg₂bi₂局域畸变与载流子散射机制研究"/>
     <w:p>
       <w:pPr>
         <w:pStyle w:val="Heading1"/>
       </w:pPr>
       <w:r>
-        <w:t xml:space="preserve">Ca/Ge双位点取代SmMg₂Bi₂的局域畸变与载流子散射机制</w:t>
+        <w:t xml:space="preserve">AI辅助的Ca/Ge双位点取代SmMg₂Bi₂局域畸变与载流子散射机制研究</w:t>
       </w:r>
     </w:p>
     <w:p>
@@ -16,7 +16,7 @@
         <w:pStyle w:val="BlockText"/>
       </w:pPr>
       <w:r>
-        <w:t xml:space="preserve">题目按青年基金“小切口”要求收敛为局域畸变与载流子散射主线。本稿依据2027版正文粘贴文本、2026版完整申请书PDF、摘要、评审意见及康鹏等综述修订。保留用户所供2027版固定提纲标题与括号说明。文中【待核实】只涉及尚无证据的事实，不补造计算结果或合作条件；研究样本数与验收阈值为建议设计。原PDF为2026版，不作为已发布的2027官方模板依据。正文以不超过8000字为编辑约束，最终以2027年度正式指南及系统要求为准。</w:t>
+        <w:t xml:space="preserve">题目在青年基金“小切口”主线上增加“AI辅助”，具体指物理描述符、小样本主动学习与独立计算验证。本稿依据2027版正文粘贴文本、2026版完整申请书PDF、摘要、评审意见及康鹏等综述修订。保留用户所供2027版固定提纲标题与括号说明。文中【待核实】只涉及尚无证据的事实，不补造计算结果或合作条件；研究样本数与验收阈值为建议设计。原PDF为2026版，不作为已发布的2027官方模板依据。正文以不超过8000字为编辑约束，最终以2027年度正式指南及系统要求为准。</w:t>
       </w:r>
     </w:p>
     <w:bookmarkStart w:id="20" w:name="中文摘要"/>
@@ -33,7 +33,7 @@
         <w:pStyle w:val="FirstParagraph"/>
       </w:pPr>
       <w:r>
-        <w:t xml:space="preserve">Zintl相热电材料中，元素取代引起的带边态变化与载流子散射相互耦合，限制了功率因子的优化。已有Ca合金化和Ge掺杂实验为研究SmMg₂Bi₂提供了基础，但双位点取代引起的局域畸变如何改变载流子散射，以及能带调控收益能否补偿迁移率损失，仍需阐明。本项目以Ca/Ge双位点取代SmMg₂Bi₂为对象，采用密度泛函理论构建母相、单取代和双取代对照，处理Sm局域电子态与自旋轨道耦合，区分化学取代和结构弛豫对带边态的贡献；结合显式载流子散射计算，分析局域键合、散射通道与迁移率的联系，确定功率因子改善或下降的微观原因。利用小样本主动学习辅助选取关键构型，以独立计算验证机制，并对少量代表构型开展热输运检验。预期揭示局域畸变影响载流子散射的作用路径与适用条件，为SmMg₂Bi₂的取代设计提供理论依据。</w:t>
+        <w:t xml:space="preserve">Zintl相热电材料中，元素取代引起的带边态变化与载流子散射相互耦合，限制了功率因子的优化。已有Ca合金化和Ge掺杂实验为研究SmMg₂Bi₂提供了基础，但双位点取代引起的局域畸变如何改变载流子散射，以及能带调控收益能否补偿迁移率损失，仍需阐明。本项目以Ca/Ge双位点取代SmMg₂Bi₂为对象，采用密度泛函理论构建母相、单取代和双取代对照，处理Sm局域电子态与自旋轨道耦合，区分化学取代和结构弛豫对带边态的贡献；结合显式载流子散射计算，分析局域键合、散射通道与迁移率的联系，确定功率因子改善或下降的微观原因。以物理描述符与不确定性约束的小样本主动学习辅助选取关键构型，以独立计算验证机制，并对少量代表构型开展热输运检验。预期揭示局域畸变影响载流子散射的作用路径与适用条件，为SmMg₂Bi₂的取代设计提供理论依据。</w:t>
       </w:r>
     </w:p>
     <w:p>
@@ -227,6 +227,14 @@
       </w:pPr>
       <w:r>
         <w:t xml:space="preserve">围绕“取代构型—局域键合—带边态与散射—电热输运”建立研究链条。先以母相、Ca单取代、Ge单取代和双取代作配对对照，再通过固定几何与结构弛豫、质量与力常数变化分解贡献，最后结合显式散射检验迁移率与功率因子变化；声子输运仅作有限热电约束。SmMg₂Bi₂采用三方P−3m1结构（空间群第164号）；具体原子占位以原始结构文件核实。研究限于该母相及Ca/Ge取代构型，不另设同结构材料的独立验证任务。</w:t>
+      </w:r>
+    </w:p>
+    <w:p>
+      <w:pPr>
+        <w:pStyle w:val="BodyText"/>
+      </w:pPr>
+      <w:r>
+        <w:t xml:space="preserve">人工智能（Artificial Intelligence，AI）在本项目中的作用限定为高成本计算的选点和信息整合：以物理描述符建立小样本基线，根据预测不确定性与机制判别需求选择新增构型，再用独立第一性原理计算验证。模型泛化、误差与采样效率通过分组测试和相同预算的随机选点对照评价；若未体现优势，采用空间覆盖采样继续完成机制研究。AI不替代散射计算，不预设性能改善，也不单独构成科学创新点。</w:t>
       </w:r>
     </w:p>
     <w:bookmarkEnd w:id="24"/>
@@ -1141,7 +1149,7 @@
       <w:pStyle w:val="Header"/>
     </w:pPr>
     <w:r>
-      <w:t>2027年度青年科学基金项目（C类）｜聚焦修订稿</w:t>
+      <w:t>2027青年科学基金项目（C类）｜AI辅助修订稿</w:t>
     </w:r>
   </w:p>
 </w:hdr>

</xml_diff>